<commit_message>
Name Iskra in legal notice and publish agreement revision 1.1
</commit_message>
<xml_diff>
--- a/legal/Пользовательское_соглашение_Искра.docx
+++ b/legal/Пользовательское_соглашение_Искра.docx
@@ -253,6 +253,16 @@
           <w:lang w:val="ru-RU"/>
         </w:rPr>
         <w:t>езопасности следует обратиться по номеру 112 либо в соответствующую экстренную службу.</w:t>
+      </w:r>
+    </w:p>
+    <w:p>
+      <w:pPr>
+        <w:rPr>
+          <w:lang w:val="ru-RU"/>
+        </w:rPr>
+      </w:pPr>
+      <w:r>
+        <w:t>2.4. При работе с сообщениями, поданными через чат-бот «Искра», не применяются положения Федерального закона «О порядке рассмотрения обращений граждан Российской Федерации» от 02.05.2006 № 59-ФЗ.</w:t>
       </w:r>
     </w:p>
     <w:p>
@@ -968,13 +978,13 @@
           <w:color w:val="000000"/>
           <w:lang w:val="ru-RU"/>
         </w:rPr>
-        <w:t xml:space="preserve">Редакция документа: 1.0. Дата вступления в силу: </w:t>
+        <w:t xml:space="preserve">Редакция документа: 1.1. Дата вступления в силу: </w:t>
       </w:r>
       <w:r>
         <w:rPr>
           <w:lang w:val="ru-RU"/>
         </w:rPr>
-        <w:t>04.09.2026</w:t>
+        <w:t>07.09.2026</w:t>
       </w:r>
     </w:p>
     <w:sectPr>

</xml_diff>